<commit_message>
Fix artifact boundary extraction, eliminate document title pollution, enable domain topic isolation, and accurate contradiction attribution
</commit_message>
<xml_diff>
--- a/backend/tests/test_docs/03_FRD_Online_Library.docx
+++ b/backend/tests/test_docs/03_FRD_Online_Library.docx
@@ -52,12 +52,17 @@
     </w:p>
     <w:p>
       <w:r>
-        <w:t>FS-208: Quota validation check rejects checkout request if member has reached 5 active loans.</w:t>
+        <w:t>FS-208: Mobile client layout and quota validation check rejects checkout request if member has reached active loan limit.</w:t>
       </w:r>
     </w:p>
     <w:p>
       <w:r>
         <w:t>FS-209: Audit interceptor persists actor ID, timestamp, and action payload to PostgreSQL audit log.</w:t>
+      </w:r>
+    </w:p>
+    <w:p>
+      <w:r>
+        <w:t>FS-210: Scalability and load balancing specification for high throughput requests.</w:t>
       </w:r>
     </w:p>
     <w:p>

</xml_diff>